<commit_message>
Add dedicated Admin Panel for Layanan Inklusif (Braille & Disabilitas) and update Word/Excel guides with direct admin links
</commit_message>
<xml_diff>
--- a/AKIP_PKTJ_2025_LENGKAP_DENGAN_PATH_FILE.docx
+++ b/AKIP_PKTJ_2025_LENGKAP_DENGAN_PATH_FILE.docx
@@ -12479,7 +12479,7 @@
                 <w:color w:val="004A99"/>
                 <w:sz w:val="14"/>
               </w:rPr>
-              <w:t>http://ppid.pktj.ac.id/admin/prosedur/sop-permintaan</w:t>
+              <w:t>http://ppid.pktj.ac.id/admin/layanan/aksesibilitas</w:t>
             </w:r>
           </w:p>
         </w:tc>
@@ -12555,7 +12555,7 @@
                 <w:color w:val="002B5C"/>
                 <w:sz w:val="15"/>
               </w:rPr>
-              <w:t>Inovasi Formulir Layanan Braille, Audio Text-to-Speech, &amp; Video Panduan Bahasa Isyarat</w:t>
+              <w:t>Dokumen Formulir Permohonan &amp; Keberatan Huruf Braille serta Laporan Inovasi Layanan Ramah Disabilitas PPID PKTJ Tegal</w:t>
               <w:br/>
             </w:r>
             <w:r>
@@ -12564,7 +12564,7 @@
                 <w:color w:val="64748B"/>
                 <w:sz w:val="14"/>
               </w:rPr>
-              <w:t>Inovasi inklusivitas pelayanan informasi publik bagi penyandang disabilitas tunanetra, tunarungu, dan tunawicara.</w:t>
+              <w:t>Inovasi pemenuhan sarana aksesibilitas terpadu bagi penyandang disabilitas: Formulir Permohonan Braille, Pernyataan Keberatan Braille, Audio Text-to-Speech otomatis, serta Video Panduan Bahasa Isyarat (Bisindo).</w:t>
             </w:r>
           </w:p>
         </w:tc>
@@ -12586,7 +12586,7 @@
                 <w:color w:val="B45309"/>
                 <w:sz w:val="15"/>
               </w:rPr>
-              <w:t>FORMULIR PERMOHONAN BRAILLE.pdf &amp; Inovasi PPID.docx</w:t>
+              <w:t>FORMULIR PERMOHONAN BRAILE.pdf, PERNYATAAN KEBERATAN BRAILE.pdf, &amp; Inovasi PPID.docx</w:t>
               <w:br/>
             </w:r>
             <w:r>
@@ -12595,7 +12595,7 @@
                 <w:color w:val="475569"/>
                 <w:sz w:val="14"/>
               </w:rPr>
-              <w:t>AKIP PKTJ 2025\Indikator I\FORMULIR PERMOHONAN INFORMASI PUBLIK BRAILE.pdf &amp; Inovasi PPID.docx</w:t>
+              <w:t>AKIP PKTJ 2025\Indikator I\FORMULIR PERMOHONAN BRAILE.pdf, PERNYATAAN KEBERATAN BRAILE.pdf, &amp; Inovasi PPID.docx</w:t>
             </w:r>
             <w:r>
               <w:rPr>
@@ -12626,7 +12626,7 @@
                 <w:sz w:val="14"/>
                 <w:u w:val="single"/>
               </w:rPr>
-              <w:t>http://ppid.pktj.ac.id/admin/prosedur/sop-permintaan</w:t>
+              <w:t>http://ppid.pktj.ac.id/admin/layanan/aksesibilitas</w:t>
             </w:r>
           </w:p>
         </w:tc>

</xml_diff>